<commit_message>
Relatorio e apresentacao com a analise de entrega e recompra
</commit_message>
<xml_diff>
--- a/reports/relatorio_executivo_crescimento_receita.docx
+++ b/reports/relatorio_executivo_crescimento_receita.docx
@@ -110,6 +110,14 @@
       </w:pPr>
       <w:r>
         <w:t xml:space="preserve">A receita também está bastante concentrada em poucos estados. São Paulo sozinho responde por 37% do total, e os cinco maiores estados somam 73%. Por outro lado, a empresa está bem distribuída em dois aspectos importantes: são 72 categorias de produto, e os 10 maiores vendedores, de um total de 3.029, somam apenas 13% da receita. Isso mostra que ela não depende de um único produto nem de poucos fornecedores.</w:t>
+      </w:r>
+    </w:p>
+    <w:p>
+      <w:pPr>
+        <w:spacing w:after="160"/>
+      </w:pPr>
+      <w:r>
+        <w:t xml:space="preserve">Essa concentração geográfica tem relação com a operação. Os cinco estados que concentram a receita recebem em 10,5 dias na média, enquanto os outros 22 esperam 17,3 dias e ainda pagam quase o dobro de frete em proporção ao produto. Isso importa para a decisão de investimento, porque um mercado que não compra é um problema sem solução simples, enquanto uma operação que não entrega é um problema endereçável.</w:t>
       </w:r>
     </w:p>
     <w:p>
@@ -961,19 +969,19 @@
     </w:p>
     <w:p>
       <w:pPr>
-        <w:pStyle w:val="Heading1"/>
-        <w:spacing w:after="160" w:before="320"/>
-      </w:pPr>
-      <w:r>
-        <w:t xml:space="preserve">4. Projeção para os próximos meses</w:t>
-      </w:r>
-    </w:p>
-    <w:p>
-      <w:pPr>
-        <w:spacing w:after="160"/>
-      </w:pPr>
-      <w:r>
-        <w:t xml:space="preserve">Como a base termina em agosto de 2018 e a receita está estável, usei a média dos três últimos meses para estimar os meses seguintes.</w:t>
+        <w:pStyle w:val="Heading2"/>
+        <w:spacing w:after="120" w:before="240"/>
+      </w:pPr>
+      <w:r>
+        <w:t xml:space="preserve">3.8 Por que a receita está presa a poucos estados</w:t>
+      </w:r>
+    </w:p>
+    <w:p>
+      <w:pPr>
+        <w:spacing w:after="160"/>
+      </w:pPr>
+      <w:r>
+        <w:t xml:space="preserve">As seções 3.5 e 3.7 deixaram duas perguntas juntas: por que São Paulo concentra tanto, e por que o cliente parou de vir. Fui testar se as duas têm a mesma causa, olhando quanto tempo cada estado espera para receber.</w:t>
       </w:r>
     </w:p>
     <w:p>
@@ -984,7 +992,7 @@
       <w:r>
         <w:drawing>
           <wp:inline distT="0" distB="0" distL="0" distR="0">
-            <wp:extent cx="5429250" cy="2466975"/>
+            <wp:extent cx="4762500" cy="2381250"/>
             <wp:effectExtent t="0" r="0" b="0" l="0"/>
             <wp:docPr id="1" name="" descr="" title=""/>
             <wp:cNvGraphicFramePr>
@@ -1009,6 +1017,282 @@
                   <pic:spPr bwMode="auto">
                     <a:xfrm>
                       <a:off x="0" y="0"/>
+                      <a:ext cx="4762500" cy="2381250"/>
+                    </a:xfrm>
+                    <a:prstGeom prst="rect">
+                      <a:avLst/>
+                    </a:prstGeom>
+                  </pic:spPr>
+                </pic:pic>
+              </a:graphicData>
+            </a:graphic>
+          </wp:inline>
+        </w:drawing>
+      </w:r>
+    </w:p>
+    <w:p>
+      <w:pPr>
+        <w:spacing w:after="280"/>
+        <w:jc w:val="center"/>
+      </w:pPr>
+      <w:r>
+        <w:rPr>
+          <w:i/>
+          <w:iCs/>
+          <w:color w:val="555555"/>
+          <w:sz w:val="18"/>
+          <w:szCs w:val="18"/>
+        </w:rPr>
+        <w:t xml:space="preserve">Figura 9. Participação na receita e tempo médio de entrega, por estado.</w:t>
+      </w:r>
+    </w:p>
+    <w:p>
+      <w:pPr>
+        <w:spacing w:after="160"/>
+      </w:pPr>
+      <w:r>
+        <w:t xml:space="preserve">O padrão é claro. Os cinco estados que somam 73,1% da receita recebem em 10,5 dias na média. Os outros 22, que dividem 26,9%, esperam 17,3 dias. São Paulo é o mais rápido de todos, com 8,3 dias, e Roraima o mais lento, com 29,5. A correlação entre tempo de entrega e participação na receita é de -0,60.</w:t>
+      </w:r>
+    </w:p>
+    <w:p>
+      <w:pPr>
+        <w:spacing w:after="160"/>
+      </w:pPr>
+      <w:r>
+        <w:t xml:space="preserve">Não é só o tempo, é também o custo. Em São Paulo o frete equivale a 13,8% do valor do produto. No Maranhão e em Roraima passa de 26%, quase o dobro. Comprar fora do Sudeste demora mais e sai mais caro ao mesmo tempo.</w:t>
+      </w:r>
+    </w:p>
+    <w:p>
+      <w:pPr>
+        <w:spacing w:after="160"/>
+      </w:pPr>
+      <w:r>
+        <w:t xml:space="preserve">Vale registrar que isso é correlação e não prova de causa, porque São Paulo também concentra população e renda. Mas a entrega é a parte do problema que a empresa consegue mudar, e é isso que torna esse achado acionável.</w:t>
+      </w:r>
+    </w:p>
+    <w:p>
+      <w:pPr>
+        <w:spacing w:after="60" w:before="120"/>
+        <w:jc w:val="center"/>
+      </w:pPr>
+      <w:r>
+        <w:drawing>
+          <wp:inline distT="0" distB="0" distL="0" distR="0">
+            <wp:extent cx="5143500" cy="2571750"/>
+            <wp:effectExtent t="0" r="0" b="0" l="0"/>
+            <wp:docPr id="1" name="" descr="" title=""/>
+            <wp:cNvGraphicFramePr>
+              <a:graphicFrameLocks xmlns:a="http://schemas.openxmlformats.org/drawingml/2006/main" noChangeAspect="1"/>
+            </wp:cNvGraphicFramePr>
+            <a:graphic xmlns:a="http://schemas.openxmlformats.org/drawingml/2006/main">
+              <a:graphicData uri="http://schemas.openxmlformats.org/drawingml/2006/picture">
+                <pic:pic xmlns:pic="http://schemas.openxmlformats.org/drawingml/2006/picture">
+                  <pic:nvPicPr>
+                    <pic:cNvPr id="0" name="" descr=""/>
+                    <pic:cNvPicPr>
+                      <a:picLocks noChangeAspect="1" noChangeArrowheads="1"/>
+                    </pic:cNvPicPr>
+                  </pic:nvPicPr>
+                  <pic:blipFill>
+                    <a:blip r:embed="rId16" cstate="none"/>
+                    <a:srcRect/>
+                    <a:stretch>
+                      <a:fillRect/>
+                    </a:stretch>
+                  </pic:blipFill>
+                  <pic:spPr bwMode="auto">
+                    <a:xfrm>
+                      <a:off x="0" y="0"/>
+                      <a:ext cx="5143500" cy="2571750"/>
+                    </a:xfrm>
+                    <a:prstGeom prst="rect">
+                      <a:avLst/>
+                    </a:prstGeom>
+                  </pic:spPr>
+                </pic:pic>
+              </a:graphicData>
+            </a:graphic>
+          </wp:inline>
+        </w:drawing>
+      </w:r>
+    </w:p>
+    <w:p>
+      <w:pPr>
+        <w:spacing w:after="280"/>
+        <w:jc w:val="center"/>
+      </w:pPr>
+      <w:r>
+        <w:rPr>
+          <w:i/>
+          <w:iCs/>
+          <w:color w:val="555555"/>
+          <w:sz w:val="18"/>
+          <w:szCs w:val="18"/>
+        </w:rPr>
+        <w:t xml:space="preserve">Figura 10. Percentual de pedidos atrasados por estado.</w:t>
+      </w:r>
+    </w:p>
+    <w:p>
+      <w:pPr>
+        <w:spacing w:after="160"/>
+      </w:pPr>
+      <w:r>
+        <w:t xml:space="preserve">Um detalhe importante para quem for agir sobre isso: atrasar e demorar não são a mesma coisa. Alagoas entrega em 24 dias e atrasa 21,5% das vezes, enquanto Roraima demora mais, 29,5 dias, e atrasa 12,5%. Amapá leva 26,7 dias e atrasa apenas 3%. Onde o atraso é alto sem que o tempo seja o pior, o problema está no prazo prometido ao cliente, que é bem mais barato de corrigir do que a operação.</w:t>
+      </w:r>
+    </w:p>
+    <w:p>
+      <w:pPr>
+        <w:pStyle w:val="Heading2"/>
+        <w:spacing w:after="120" w:before="240"/>
+      </w:pPr>
+      <w:r>
+        <w:t xml:space="preserve">3.9 O atraso afasta o cliente, mas menos do que parece</w:t>
+      </w:r>
+    </w:p>
+    <w:p>
+      <w:pPr>
+        <w:spacing w:after="160"/>
+      </w:pPr>
+      <w:r>
+        <w:t xml:space="preserve">Se a entrega ruim explica a concentração, ela também deveria explicar por que o cliente não volta. Para testar isso, separei os clientes pela primeira compra: quem recebeu no prazo e quem recebeu com atraso. Considerei apenas quem comprou até fevereiro de 2018, para que todos tivessem pelo menos seis meses de janela para retornar.</w:t>
+      </w:r>
+    </w:p>
+    <w:p>
+      <w:pPr>
+        <w:spacing w:after="60" w:before="120"/>
+        <w:jc w:val="center"/>
+      </w:pPr>
+      <w:r>
+        <w:drawing>
+          <wp:inline distT="0" distB="0" distL="0" distR="0">
+            <wp:extent cx="3619500" cy="1809750"/>
+            <wp:effectExtent t="0" r="0" b="0" l="0"/>
+            <wp:docPr id="1" name="" descr="" title=""/>
+            <wp:cNvGraphicFramePr>
+              <a:graphicFrameLocks xmlns:a="http://schemas.openxmlformats.org/drawingml/2006/main" noChangeAspect="1"/>
+            </wp:cNvGraphicFramePr>
+            <a:graphic xmlns:a="http://schemas.openxmlformats.org/drawingml/2006/main">
+              <a:graphicData uri="http://schemas.openxmlformats.org/drawingml/2006/picture">
+                <pic:pic xmlns:pic="http://schemas.openxmlformats.org/drawingml/2006/picture">
+                  <pic:nvPicPr>
+                    <pic:cNvPr id="0" name="" descr=""/>
+                    <pic:cNvPicPr>
+                      <a:picLocks noChangeAspect="1" noChangeArrowheads="1"/>
+                    </pic:cNvPicPr>
+                  </pic:nvPicPr>
+                  <pic:blipFill>
+                    <a:blip r:embed="rId17" cstate="none"/>
+                    <a:srcRect/>
+                    <a:stretch>
+                      <a:fillRect/>
+                    </a:stretch>
+                  </pic:blipFill>
+                  <pic:spPr bwMode="auto">
+                    <a:xfrm>
+                      <a:off x="0" y="0"/>
+                      <a:ext cx="3619500" cy="1809750"/>
+                    </a:xfrm>
+                    <a:prstGeom prst="rect">
+                      <a:avLst/>
+                    </a:prstGeom>
+                  </pic:spPr>
+                </pic:pic>
+              </a:graphicData>
+            </a:graphic>
+          </wp:inline>
+        </w:drawing>
+      </w:r>
+    </w:p>
+    <w:p>
+      <w:pPr>
+        <w:spacing w:after="280"/>
+        <w:jc w:val="center"/>
+      </w:pPr>
+      <w:r>
+        <w:rPr>
+          <w:i/>
+          <w:iCs/>
+          <w:color w:val="555555"/>
+          <w:sz w:val="18"/>
+          <w:szCs w:val="18"/>
+        </w:rPr>
+        <w:t xml:space="preserve">Figura 11. Percentual de clientes que voltaram a comprar, conforme a primeira entrega.</w:t>
+      </w:r>
+    </w:p>
+    <w:p>
+      <w:pPr>
+        <w:spacing w:after="160"/>
+      </w:pPr>
+      <w:r>
+        <w:t xml:space="preserve">Entre os clientes cuja primeira compra chegou no prazo, 4,08% voltaram a comprar. Entre os que tiveram atraso, 3,16%. A queda é de 22,6% em termos relativos, e o teste estatístico confirma que não é acaso, com p-valor de 0,007.</w:t>
+      </w:r>
+    </w:p>
+    <w:p>
+      <w:pPr>
+        <w:spacing w:after="160"/>
+      </w:pPr>
+      <w:r>
+        <w:t xml:space="preserve">O tamanho do efeito, porém, precisa ser dito com honestidade: a diferença absoluta é de 0,92 ponto percentual. Mesmo entregando tudo no prazo, cerca de 96% dos clientes não voltam. O atraso agrava um problema de retenção que já existe por outro motivo.</w:t>
+      </w:r>
+    </w:p>
+    <w:p>
+      <w:pPr>
+        <w:spacing w:after="160"/>
+      </w:pPr>
+      <w:r>
+        <w:t xml:space="preserve">Isso tem uma implicação prática para quem for dimensionar perdas. Estimativas que multiplicam o número de clientes insatisfeitos pelo ticket médio cheio assumem que todos teriam voltado, e os dados não sustentam essa premissa. O cálculo correto usa a diferença entre os dois grupos.</w:t>
+      </w:r>
+    </w:p>
+    <w:p>
+      <w:pPr>
+        <w:pStyle w:val="Heading1"/>
+        <w:spacing w:after="160" w:before="320"/>
+      </w:pPr>
+      <w:r>
+        <w:t xml:space="preserve">4. Projeção para os próximos meses</w:t>
+      </w:r>
+    </w:p>
+    <w:p>
+      <w:pPr>
+        <w:spacing w:after="160"/>
+      </w:pPr>
+      <w:r>
+        <w:t xml:space="preserve">Como a base termina em agosto de 2018 e a receita está estável, usei a média dos três últimos meses para estimar os meses seguintes.</w:t>
+      </w:r>
+    </w:p>
+    <w:p>
+      <w:pPr>
+        <w:spacing w:after="60" w:before="120"/>
+        <w:jc w:val="center"/>
+      </w:pPr>
+      <w:r>
+        <w:drawing>
+          <wp:inline distT="0" distB="0" distL="0" distR="0">
+            <wp:extent cx="5429250" cy="2466975"/>
+            <wp:effectExtent t="0" r="0" b="0" l="0"/>
+            <wp:docPr id="1" name="" descr="" title=""/>
+            <wp:cNvGraphicFramePr>
+              <a:graphicFrameLocks xmlns:a="http://schemas.openxmlformats.org/drawingml/2006/main" noChangeAspect="1"/>
+            </wp:cNvGraphicFramePr>
+            <a:graphic xmlns:a="http://schemas.openxmlformats.org/drawingml/2006/main">
+              <a:graphicData uri="http://schemas.openxmlformats.org/drawingml/2006/picture">
+                <pic:pic xmlns:pic="http://schemas.openxmlformats.org/drawingml/2006/picture">
+                  <pic:nvPicPr>
+                    <pic:cNvPr id="0" name="" descr=""/>
+                    <pic:cNvPicPr>
+                      <a:picLocks noChangeAspect="1" noChangeArrowheads="1"/>
+                    </pic:cNvPicPr>
+                  </pic:nvPicPr>
+                  <pic:blipFill>
+                    <a:blip r:embed="rId18" cstate="none"/>
+                    <a:srcRect/>
+                    <a:stretch>
+                      <a:fillRect/>
+                    </a:stretch>
+                  </pic:blipFill>
+                  <pic:spPr bwMode="auto">
+                    <a:xfrm>
+                      <a:off x="0" y="0"/>
                       <a:ext cx="5429250" cy="2466975"/>
                     </a:xfrm>
                     <a:prstGeom prst="rect">
@@ -1035,7 +1319,7 @@
           <w:sz w:val="18"/>
           <w:szCs w:val="18"/>
         </w:rPr>
-        <w:t xml:space="preserve">Figura 9. Receita mensal e projeção para os três meses seguintes.</w:t>
+        <w:t xml:space="preserve">Figura 12. Receita mensal e projeção para os três meses seguintes.</w:t>
       </w:r>
     </w:p>
     <w:p>
@@ -1127,6 +1411,22 @@
     </w:p>
     <w:p>
       <w:pPr>
+        <w:spacing w:after="160"/>
+      </w:pPr>
+      <w:r>
+        <w:t xml:space="preserve">A operação ajuda a explicar onde essa demanda não aparece. Os estados que quase não compram são também os que esperam mais pela entrega e pagam mais caro pelo frete, e clientes que sofreram atraso na primeira compra voltam 22,6% menos. Melhorar logística regional ataca as duas coisas ao mesmo tempo: destrava mercado onde há espaço e reduz a perda de quem já comprou.</w:t>
+      </w:r>
+    </w:p>
+    <w:p>
+      <w:pPr>
+        <w:spacing w:after="160"/>
+      </w:pPr>
+      <w:r>
+        <w:t xml:space="preserve">É preciso ser honesto sobre o limite dessa leitura. O efeito do atraso sobre a recompra é real, mas pequeno em termos absolutos, menos de um ponto percentual, porque a recompra da base inteira já é de cerca de 4%. Resolver a entrega é necessário, mas não vai criar sozinho uma base de clientes fiéis.</w:t>
+      </w:r>
+    </w:p>
+    <w:p>
+      <w:pPr>
         <w:spacing w:after="120"/>
       </w:pPr>
       <w:r>
@@ -1160,7 +1460,20 @@
         <w:spacing w:after="100"/>
       </w:pPr>
       <w:r>
-        <w:t xml:space="preserve">Crescer fora dos cinco maiores estados. Eles concentram 73,1% da receita, então os outros 22 estados, que hoje somam 26,9%, representam bastante espaço para investir em ação comercial e logística.</w:t>
+        <w:t xml:space="preserve">Tratar a expansão geográfica como problema de logística, e não apenas de ação comercial. Os 22 estados fora do topo somam 26,9% da receita, esperam 17,3 dias pela entrega e pagam quase o dobro de frete em proporção ao produto. Reduzir prazo e custo de frete nessas regiões ataca a causa, enquanto campanha comercial sozinha esbarra na mesma barreira.</w:t>
+      </w:r>
+    </w:p>
+    <w:p>
+      <w:pPr>
+        <w:pStyle w:val="ListParagraph"/>
+        <w:numPr>
+          <w:ilvl w:val="0"/>
+          <w:numId w:val="1"/>
+        </w:numPr>
+        <w:spacing w:after="100"/>
+      </w:pPr>
+      <w:r>
+        <w:t xml:space="preserve">Revisar o prazo prometido nos estados onde ele está mal calibrado. Alagoas atrasa 21,5% das entregas com tempo médio de 24 dias, enquanto Roraima demora mais e atrasa menos. Ajustar a promessa é mais rápido e mais barato do que mudar a operação, e melhora a experiência de imediato.</w:t>
       </w:r>
     </w:p>
     <w:p>

</xml_diff>